<commit_message>
Update Technical Report DOCX & MD: add Production Deployment and Responsible AI Measures table
</commit_message>
<xml_diff>
--- a/PCCOE_Pranav_Ravindra_Harad_123B1F028_CS4_AIML/Documentation/PCCOE_PranavHarad_123B1F028_Technical_Report.docx
+++ b/PCCOE_Pranav_Ravindra_Harad_123B1F028_CS4_AIML/Documentation/PCCOE_PranavHarad_123B1F028_Technical_Report.docx
@@ -1337,6 +1337,64 @@
                 <w:sz w:val="19"/>
               </w:rPr>
               <w:t>Hardcoded regex and AST syntax checkers for MISRA Rules 12.1, 21.3, 16.4, 17.7, 9.1, 11.4, and CERT CON33-C.</w:t>
+            </w:r>
+          </w:p>
+        </w:tc>
+      </w:tr>
+      <w:tr>
+        <w:tc>
+          <w:tcPr>
+            <w:tcW w:type="dxa" w:w="3168"/>
+            <w:shd w:fill="F8FAFC"/>
+            <w:tcMar>
+              <w:top w:w="120" w:type="dxa"/>
+              <w:bottom w:w="120" w:type="dxa"/>
+              <w:left w:w="160" w:type="dxa"/>
+              <w:right w:w="160" w:type="dxa"/>
+            </w:tcMar>
+          </w:tcPr>
+          <w:p>
+            <w:pPr>
+              <w:spacing w:before="0" w:after="0" w:line="276" w:lineRule="auto"/>
+              <w:jc w:val="left"/>
+            </w:pPr>
+            <w:r/>
+            <w:r>
+              <w:rPr>
+                <w:rFonts w:ascii="Calibri" w:hAnsi="Calibri"/>
+                <w:b/>
+                <w:color w:val="0F172A"/>
+                <w:sz w:val="19"/>
+              </w:rPr>
+              <w:t>Production Deployment</w:t>
+            </w:r>
+          </w:p>
+        </w:tc>
+        <w:tc>
+          <w:tcPr>
+            <w:tcW w:type="dxa" w:w="6624"/>
+            <w:shd w:fill="F8FAFC"/>
+            <w:tcMar>
+              <w:top w:w="120" w:type="dxa"/>
+              <w:bottom w:w="120" w:type="dxa"/>
+              <w:left w:w="160" w:type="dxa"/>
+              <w:right w:w="160" w:type="dxa"/>
+            </w:tcMar>
+          </w:tcPr>
+          <w:p>
+            <w:pPr>
+              <w:spacing w:before="0" w:after="0" w:line="276" w:lineRule="auto"/>
+              <w:jc w:val="left"/>
+            </w:pPr>
+            <w:r/>
+            <w:r>
+              <w:rPr>
+                <w:rFonts w:ascii="Calibri" w:hAnsi="Calibri"/>
+                <w:b w:val="0"/>
+                <w:color w:val="0F172A"/>
+                <w:sz w:val="19"/>
+              </w:rPr>
+              <w:t>Waitress Multi-Threaded WSGI Server (Port 5000) / Air-Gapped Docker Container (docker-compose) / Automated GitHub Actions CI/CD Pipeline exporting OASIS SARIF v2.1.0.</w:t>
             </w:r>
           </w:p>
         </w:tc>
@@ -2887,101 +2945,314 @@
           <w:color w:val="002B49"/>
           <w:sz w:val="28"/>
         </w:rPr>
-        <w:t>7. Responsible AI &amp; Functional Safety Governance</w:t>
+        <w:t>7. Responsible AI Measures &amp; Functional Safety Governance</w:t>
       </w:r>
     </w:p>
-    <w:p>
-      <w:pPr>
-        <w:pStyle w:val="ListBullet"/>
-        <w:spacing w:before="0" w:after="80" w:line="276" w:lineRule="auto"/>
-      </w:pPr>
-      <w:r>
-        <w:rPr>
-          <w:rFonts w:ascii="Calibri" w:hAnsi="Calibri"/>
-          <w:b/>
-          <w:color w:val="0F172A"/>
-          <w:sz w:val="20"/>
-        </w:rPr>
-        <w:t xml:space="preserve">• Grounding &amp; Verifiability: </w:t>
-      </w:r>
-      <w:r>
-        <w:rPr>
-          <w:rFonts w:ascii="Calibri" w:hAnsi="Calibri"/>
-          <w:color w:val="0F172A"/>
-          <w:sz w:val="20"/>
-        </w:rPr>
-        <w:t>Every flagged violation explicitly cites authentic MISRA/CERT chapter and clause numbers, preventing fabricated rules.</w:t>
-      </w:r>
-    </w:p>
-    <w:p>
-      <w:pPr>
-        <w:pStyle w:val="ListBullet"/>
-        <w:spacing w:before="0" w:after="80" w:line="276" w:lineRule="auto"/>
-      </w:pPr>
-      <w:r>
-        <w:rPr>
-          <w:rFonts w:ascii="Calibri" w:hAnsi="Calibri"/>
-          <w:b/>
-          <w:color w:val="0F172A"/>
-          <w:sz w:val="20"/>
-        </w:rPr>
-        <w:t xml:space="preserve">• Intellectual Property Privacy: </w:t>
-      </w:r>
-      <w:r>
-        <w:rPr>
-          <w:rFonts w:ascii="Calibri" w:hAnsi="Calibri"/>
-          <w:color w:val="0F172A"/>
-          <w:sz w:val="20"/>
-        </w:rPr>
-        <w:t>100% on-premises processing ensures that proprietary automotive ECU firmware is never leaked over public networks.</w:t>
-      </w:r>
-    </w:p>
-    <w:p>
-      <w:pPr>
-        <w:pStyle w:val="ListBullet"/>
-        <w:spacing w:before="0" w:after="80" w:line="276" w:lineRule="auto"/>
-      </w:pPr>
-      <w:r>
-        <w:rPr>
-          <w:rFonts w:ascii="Calibri" w:hAnsi="Calibri"/>
-          <w:b/>
-          <w:color w:val="0F172A"/>
-          <w:sz w:val="20"/>
-        </w:rPr>
-        <w:t xml:space="preserve">• Human-in-the-Loop Dispositions: </w:t>
-      </w:r>
-      <w:r>
-        <w:rPr>
-          <w:rFonts w:ascii="Calibri" w:hAnsi="Calibri"/>
-          <w:color w:val="0F172A"/>
-          <w:sz w:val="20"/>
-        </w:rPr>
-        <w:t>Engineers retain complete veto and approval power; fixes must be reviewed and approved before code integration.</w:t>
-      </w:r>
-    </w:p>
-    <w:p>
-      <w:pPr>
-        <w:pStyle w:val="ListBullet"/>
-        <w:spacing w:before="0" w:after="80" w:line="276" w:lineRule="auto"/>
-      </w:pPr>
-      <w:r>
-        <w:rPr>
-          <w:rFonts w:ascii="Calibri" w:hAnsi="Calibri"/>
-          <w:b/>
-          <w:color w:val="0F172A"/>
-          <w:sz w:val="20"/>
-        </w:rPr>
-        <w:t xml:space="preserve">• Formal Compliance Records: </w:t>
-      </w:r>
-      <w:r>
-        <w:rPr>
-          <w:rFonts w:ascii="Calibri" w:hAnsi="Calibri"/>
-          <w:color w:val="0F172A"/>
-          <w:sz w:val="20"/>
-        </w:rPr>
-        <w:t>Generates signed MISRA Deviation Permits adhering strictly to MISRA Compliance:2020 guidelines.</w:t>
-      </w:r>
-    </w:p>
+    <w:tbl>
+      <w:tblPr>
+        <w:tblW w:type="auto" w:w="0"/>
+        <w:jc w:val="center"/>
+        <w:tblLook w:firstColumn="1" w:firstRow="1" w:lastColumn="0" w:lastRow="0" w:noHBand="0" w:noVBand="1" w:val="04A0"/>
+        <w:tblBorders>
+          <w:top w:val="single" w:sz="4" w:space="0" w:color="CBD5E1"/>
+          <w:bottom w:val="single" w:sz="4" w:space="0" w:color="CBD5E1"/>
+          <w:insideH w:val="single" w:sz="4" w:space="0" w:color="CBD5E1"/>
+          <w:insideV w:val="single" w:sz="4" w:space="0" w:color="CBD5E1"/>
+          <w:left w:val="single" w:sz="4" w:space="0" w:color="CBD5E1"/>
+          <w:right w:val="single" w:sz="4" w:space="0" w:color="CBD5E1"/>
+        </w:tblBorders>
+      </w:tblPr>
+      <w:tblGrid>
+        <w:gridCol w:w="5040"/>
+        <w:gridCol w:w="5040"/>
+      </w:tblGrid>
+      <w:tr>
+        <w:tc>
+          <w:tcPr>
+            <w:tcW w:type="dxa" w:w="3168"/>
+            <w:shd w:fill="E2E8F0"/>
+            <w:tcMar>
+              <w:top w:w="120" w:type="dxa"/>
+              <w:bottom w:w="120" w:type="dxa"/>
+              <w:left w:w="160" w:type="dxa"/>
+              <w:right w:w="160" w:type="dxa"/>
+            </w:tcMar>
+          </w:tcPr>
+          <w:p>
+            <w:pPr>
+              <w:spacing w:before="0" w:after="0" w:line="276" w:lineRule="auto"/>
+              <w:jc w:val="left"/>
+            </w:pPr>
+            <w:r/>
+            <w:r>
+              <w:rPr>
+                <w:rFonts w:ascii="Calibri" w:hAnsi="Calibri"/>
+                <w:b/>
+                <w:color w:val="002B49"/>
+                <w:sz w:val="20"/>
+              </w:rPr>
+              <w:t>Area</w:t>
+            </w:r>
+          </w:p>
+        </w:tc>
+        <w:tc>
+          <w:tcPr>
+            <w:tcW w:type="dxa" w:w="6624"/>
+            <w:shd w:fill="E2E8F0"/>
+            <w:tcMar>
+              <w:top w:w="120" w:type="dxa"/>
+              <w:bottom w:w="120" w:type="dxa"/>
+              <w:left w:w="160" w:type="dxa"/>
+              <w:right w:w="160" w:type="dxa"/>
+            </w:tcMar>
+          </w:tcPr>
+          <w:p>
+            <w:pPr>
+              <w:spacing w:before="0" w:after="0" w:line="276" w:lineRule="auto"/>
+              <w:jc w:val="left"/>
+            </w:pPr>
+            <w:r/>
+            <w:r>
+              <w:rPr>
+                <w:rFonts w:ascii="Calibri" w:hAnsi="Calibri"/>
+                <w:b/>
+                <w:color w:val="002B49"/>
+                <w:sz w:val="20"/>
+              </w:rPr>
+              <w:t>Measure Adopted in This Project</w:t>
+            </w:r>
+          </w:p>
+        </w:tc>
+      </w:tr>
+      <w:tr>
+        <w:tc>
+          <w:tcPr>
+            <w:tcW w:type="dxa" w:w="3168"/>
+            <w:shd w:fill="F8FAFC"/>
+            <w:tcMar>
+              <w:top w:w="120" w:type="dxa"/>
+              <w:bottom w:w="120" w:type="dxa"/>
+              <w:left w:w="160" w:type="dxa"/>
+              <w:right w:w="160" w:type="dxa"/>
+            </w:tcMar>
+          </w:tcPr>
+          <w:p>
+            <w:pPr>
+              <w:spacing w:before="0" w:after="0" w:line="276" w:lineRule="auto"/>
+              <w:jc w:val="left"/>
+            </w:pPr>
+            <w:r/>
+            <w:r>
+              <w:rPr>
+                <w:rFonts w:ascii="Calibri" w:hAnsi="Calibri"/>
+                <w:b/>
+                <w:color w:val="0F172A"/>
+                <w:sz w:val="19"/>
+              </w:rPr>
+              <w:t>Grounding and citations</w:t>
+            </w:r>
+          </w:p>
+        </w:tc>
+        <w:tc>
+          <w:tcPr>
+            <w:tcW w:type="dxa" w:w="6624"/>
+            <w:shd w:fill="F8FAFC"/>
+            <w:tcMar>
+              <w:top w:w="120" w:type="dxa"/>
+              <w:bottom w:w="120" w:type="dxa"/>
+              <w:left w:w="160" w:type="dxa"/>
+              <w:right w:w="160" w:type="dxa"/>
+            </w:tcMar>
+          </w:tcPr>
+          <w:p>
+            <w:pPr>
+              <w:spacing w:before="0" w:after="0" w:line="276" w:lineRule="auto"/>
+              <w:jc w:val="left"/>
+            </w:pPr>
+            <w:r/>
+            <w:r>
+              <w:rPr>
+                <w:rFonts w:ascii="Calibri" w:hAnsi="Calibri"/>
+                <w:b w:val="0"/>
+                <w:color w:val="0F172A"/>
+                <w:sz w:val="19"/>
+              </w:rPr>
+              <w:t>Every flagged violation explicitly cites authentic MISRA/CERT chapter and clause numbers, preventing fabricated rules.</w:t>
+            </w:r>
+          </w:p>
+        </w:tc>
+      </w:tr>
+      <w:tr>
+        <w:tc>
+          <w:tcPr>
+            <w:tcW w:type="dxa" w:w="3168"/>
+            <w:tcMar>
+              <w:top w:w="120" w:type="dxa"/>
+              <w:bottom w:w="120" w:type="dxa"/>
+              <w:left w:w="160" w:type="dxa"/>
+              <w:right w:w="160" w:type="dxa"/>
+            </w:tcMar>
+          </w:tcPr>
+          <w:p>
+            <w:pPr>
+              <w:spacing w:before="0" w:after="0" w:line="276" w:lineRule="auto"/>
+              <w:jc w:val="left"/>
+            </w:pPr>
+            <w:r/>
+            <w:r>
+              <w:rPr>
+                <w:rFonts w:ascii="Calibri" w:hAnsi="Calibri"/>
+                <w:b/>
+                <w:color w:val="0F172A"/>
+                <w:sz w:val="19"/>
+              </w:rPr>
+              <w:t>Privacy</w:t>
+            </w:r>
+          </w:p>
+        </w:tc>
+        <w:tc>
+          <w:tcPr>
+            <w:tcW w:type="dxa" w:w="6624"/>
+            <w:tcMar>
+              <w:top w:w="120" w:type="dxa"/>
+              <w:bottom w:w="120" w:type="dxa"/>
+              <w:left w:w="160" w:type="dxa"/>
+              <w:right w:w="160" w:type="dxa"/>
+            </w:tcMar>
+          </w:tcPr>
+          <w:p>
+            <w:pPr>
+              <w:spacing w:before="0" w:after="0" w:line="276" w:lineRule="auto"/>
+              <w:jc w:val="left"/>
+            </w:pPr>
+            <w:r/>
+            <w:r>
+              <w:rPr>
+                <w:rFonts w:ascii="Calibri" w:hAnsi="Calibri"/>
+                <w:b w:val="0"/>
+                <w:color w:val="0F172A"/>
+                <w:sz w:val="19"/>
+              </w:rPr>
+              <w:t>100% on-premises processing ensures that proprietary automotive ECU firmware is never leaked over public networks.</w:t>
+            </w:r>
+          </w:p>
+        </w:tc>
+      </w:tr>
+      <w:tr>
+        <w:tc>
+          <w:tcPr>
+            <w:tcW w:type="dxa" w:w="3168"/>
+            <w:shd w:fill="F8FAFC"/>
+            <w:tcMar>
+              <w:top w:w="120" w:type="dxa"/>
+              <w:bottom w:w="120" w:type="dxa"/>
+              <w:left w:w="160" w:type="dxa"/>
+              <w:right w:w="160" w:type="dxa"/>
+            </w:tcMar>
+          </w:tcPr>
+          <w:p>
+            <w:pPr>
+              <w:spacing w:before="0" w:after="0" w:line="276" w:lineRule="auto"/>
+              <w:jc w:val="left"/>
+            </w:pPr>
+            <w:r/>
+            <w:r>
+              <w:rPr>
+                <w:rFonts w:ascii="Calibri" w:hAnsi="Calibri"/>
+                <w:b/>
+                <w:color w:val="0F172A"/>
+                <w:sz w:val="19"/>
+              </w:rPr>
+              <w:t>Security</w:t>
+            </w:r>
+          </w:p>
+        </w:tc>
+        <w:tc>
+          <w:tcPr>
+            <w:tcW w:type="dxa" w:w="6624"/>
+            <w:shd w:fill="F8FAFC"/>
+            <w:tcMar>
+              <w:top w:w="120" w:type="dxa"/>
+              <w:bottom w:w="120" w:type="dxa"/>
+              <w:left w:w="160" w:type="dxa"/>
+              <w:right w:w="160" w:type="dxa"/>
+            </w:tcMar>
+          </w:tcPr>
+          <w:p>
+            <w:pPr>
+              <w:spacing w:before="0" w:after="0" w:line="276" w:lineRule="auto"/>
+              <w:jc w:val="left"/>
+            </w:pPr>
+            <w:r/>
+            <w:r>
+              <w:rPr>
+                <w:rFonts w:ascii="Calibri" w:hAnsi="Calibri"/>
+                <w:b w:val="0"/>
+                <w:color w:val="0F172A"/>
+                <w:sz w:val="19"/>
+              </w:rPr>
+              <w:t>Air-gapped execution with zero network egress, enforcing SEI CERT C secure coding rules against buffer overflows and memory corruption.</w:t>
+            </w:r>
+          </w:p>
+        </w:tc>
+      </w:tr>
+      <w:tr>
+        <w:tc>
+          <w:tcPr>
+            <w:tcW w:type="dxa" w:w="3168"/>
+            <w:tcMar>
+              <w:top w:w="120" w:type="dxa"/>
+              <w:bottom w:w="120" w:type="dxa"/>
+              <w:left w:w="160" w:type="dxa"/>
+              <w:right w:w="160" w:type="dxa"/>
+            </w:tcMar>
+          </w:tcPr>
+          <w:p>
+            <w:pPr>
+              <w:spacing w:before="0" w:after="0" w:line="276" w:lineRule="auto"/>
+              <w:jc w:val="left"/>
+            </w:pPr>
+            <w:r/>
+            <w:r>
+              <w:rPr>
+                <w:rFonts w:ascii="Calibri" w:hAnsi="Calibri"/>
+                <w:b/>
+                <w:color w:val="0F172A"/>
+                <w:sz w:val="19"/>
+              </w:rPr>
+              <w:t>Human oversight / review</w:t>
+            </w:r>
+          </w:p>
+        </w:tc>
+        <w:tc>
+          <w:tcPr>
+            <w:tcW w:type="dxa" w:w="6624"/>
+            <w:tcMar>
+              <w:top w:w="120" w:type="dxa"/>
+              <w:bottom w:w="120" w:type="dxa"/>
+              <w:left w:w="160" w:type="dxa"/>
+              <w:right w:w="160" w:type="dxa"/>
+            </w:tcMar>
+          </w:tcPr>
+          <w:p>
+            <w:pPr>
+              <w:spacing w:before="0" w:after="0" w:line="276" w:lineRule="auto"/>
+              <w:jc w:val="left"/>
+            </w:pPr>
+            <w:r/>
+            <w:r>
+              <w:rPr>
+                <w:rFonts w:ascii="Calibri" w:hAnsi="Calibri"/>
+                <w:b w:val="0"/>
+                <w:color w:val="0F172A"/>
+                <w:sz w:val="19"/>
+              </w:rPr>
+              <w:t>Engineers retain complete veto and approval power; fixes must be reviewed and approved before code integration.</w:t>
+            </w:r>
+          </w:p>
+        </w:tc>
+      </w:tr>
+    </w:tbl>
     <w:p>
       <w:pPr>
         <w:keepNext/>
@@ -3083,6 +3354,28 @@
           <w:sz w:val="20"/>
         </w:rPr>
         <w:t>Exports OASIS SARIF v2.1.0, CSV compliance matrices, and Markdown audit reports formatted for Jenkins, SonarQube, and GitHub Advanced Security.</w:t>
+      </w:r>
+    </w:p>
+    <w:p>
+      <w:pPr>
+        <w:spacing w:before="0" w:after="80" w:line="276" w:lineRule="auto"/>
+      </w:pPr>
+      <w:r>
+        <w:rPr>
+          <w:rFonts w:ascii="Calibri" w:hAnsi="Calibri"/>
+          <w:b/>
+          <w:color w:val="0F172A"/>
+          <w:sz w:val="20"/>
+        </w:rPr>
+        <w:t xml:space="preserve">5. Enterprise Air-Gapped Deployment &amp; DevSecOps: </w:t>
+      </w:r>
+      <w:r>
+        <w:rPr>
+          <w:rFonts w:ascii="Calibri" w:hAnsi="Calibri"/>
+          <w:color w:val="0F172A"/>
+          <w:sz w:val="20"/>
+        </w:rPr>
+        <w:t>Packaged via Waitress multi-threaded WSGI server and Docker container with health checks, integrated with an automated GitHub Actions DevSecOps workflow (.github/workflows/ecu_security_audit.yml) for firmware pull-request gating.</w:t>
       </w:r>
     </w:p>
     <w:p>

</xml_diff>